<commit_message>
Complete repo reorganization: corrected cone geometry, Part II, GR, clean structure
- Corrected cone geometry everywhere: perpendicular cones, 45° contact,
  fragmentation → 30° tilt (replaces old "30-degree split" language)
- Added Part II paper: dark sector, Maxwell from torsion, Schrödinger from 5D,
  GR as late-time limit, bottom quark from Fano
- Added DOCUMENTATION_INDEX (23 original innovations) to algebra/
- Reorganized: codes to codes/, visuals to visuals/, removed duplicates
- Added 10 interactive visualizations + equation poster
- All documents in md/docx/pdf triples
- 32 predictions, 33+ problems resolved, 99.4% average match

Co-Authored-By: Claude Opus 4.6 <noreply@anthropic.com>
</commit_message>
<xml_diff>
--- a/README.docx
+++ b/README.docx
@@ -2,31 +2,7 @@
 <file path=word/document.xml><?xml version="1.0" encoding="utf-8"?>
 <w:document xmlns:w="http://schemas.openxmlformats.org/wordprocessingml/2006/main" xmlns:m="http://schemas.openxmlformats.org/officeDocument/2006/math" xmlns:r="http://schemas.openxmlformats.org/officeDocument/2006/relationships" xmlns:o="urn:schemas-microsoft-com:office:office" xmlns:v="urn:schemas-microsoft-com:vml" xmlns:w10="urn:schemas-microsoft-com:office:word" xmlns:a="http://schemas.openxmlformats.org/drawingml/2006/main" xmlns:pic="http://schemas.openxmlformats.org/drawingml/2006/picture" xmlns:wp="http://schemas.openxmlformats.org/drawingml/2006/wordprocessingDrawing">
   <w:body>
-    <w:p>
-      <w:pPr>
-        <w:pStyle w:val="Title"/>
-      </w:pPr>
-      <w:r>
-        <w:t xml:space="preserve">Mass Emergence from Two-Twistor Geometry - Summary</w:t>
-      </w:r>
-    </w:p>
-    <w:p>
-      <w:pPr>
-        <w:pStyle w:val="Author"/>
-      </w:pPr>
-      <w:r>
-        <w:t xml:space="preserve">Szőke Barna</w:t>
-      </w:r>
-    </w:p>
-    <w:p>
-      <w:pPr>
-        <w:pStyle w:val="Date"/>
-      </w:pPr>
-      <w:r>
-        <w:t xml:space="preserve">March 2026</w:t>
-      </w:r>
-    </w:p>
-    <w:bookmarkStart w:id="39" w:name="mass-emergence-from-two-twistor-geometry"/>
+    <w:bookmarkStart w:id="44" w:name="mass-emergence-from-two-twistor-geometry"/>
     <w:p>
       <w:pPr>
         <w:pStyle w:val="Heading1"/>
@@ -553,7 +529,13 @@
         <w:pStyle w:val="BodyText"/>
       </w:pPr>
       <w:r>
-        <w:t xml:space="preserve">The two T1 vectors drive two cones growing from the Fano plane:</w:t>
+        <w:t xml:space="preserve">Both cones originate in the Fano plane, lying perpendicular to each</w:t>
+      </w:r>
+      <w:r>
+        <w:t xml:space="preserve"> </w:t>
+      </w:r>
+      <w:r>
+        <w:t xml:space="preserve">other and rotating in opposite directions:</w:t>
       </w:r>
       <w:r>
         <w:t xml:space="preserve"> </w:t>
@@ -567,12 +549,6 @@
       <w:r>
         <w:t xml:space="preserve">- Cone B: counter-clockwise winding (driven by t2 vector, 90 deg delayed)</w:t>
       </w:r>
-      <w:r>
-        <w:t xml:space="preserve"> </w:t>
-      </w:r>
-      <w:r>
-        <w:t xml:space="preserve">- Perpendicular axes, both in the Fano plane</w:t>
-      </w:r>
     </w:p>
     <w:p>
       <w:pPr>
@@ -593,19 +569,13 @@
         <w:pStyle w:val="BodyText"/>
       </w:pPr>
       <w:r>
-        <w:t xml:space="preserve">At 90-degree opening (45-degree half-angle from each axis), the two</w:t>
-      </w:r>
-      <w:r>
-        <w:t xml:space="preserve"> </w:t>
-      </w:r>
-      <w:r>
-        <w:t xml:space="preserve">cones contact. 45 degrees is forced: it is the maximum half-angle for</w:t>
-      </w:r>
-      <w:r>
-        <w:t xml:space="preserve"> </w:t>
-      </w:r>
-      <w:r>
-        <w:t xml:space="preserve">two perpendicular axes (45 + 45 = 90).</w:t>
+        <w:t xml:space="preserve">At 45-degree half-angle, the two perpendicular cones contact</w:t>
+      </w:r>
+      <w:r>
+        <w:t xml:space="preserve"> </w:t>
+      </w:r>
+      <w:r>
+        <w:t xml:space="preserve">(45 + 45 = 90 degrees between axes). This is forced geometry.</w:t>
       </w:r>
     </w:p>
     <w:p>
@@ -613,19 +583,19 @@
         <w:pStyle w:val="BodyText"/>
       </w:pPr>
       <w:r>
-        <w:t xml:space="preserve">At contact: the twist. Pin_{+,-,-} activates. The t2 vector splits:</w:t>
-      </w:r>
-      <w:r>
-        <w:t xml:space="preserve"> </w:t>
-      </w:r>
-      <w:r>
-        <w:t xml:space="preserve">- t2 stays with Cone A (visible sector)</w:t>
-      </w:r>
-      <w:r>
-        <w:t xml:space="preserve"> </w:t>
-      </w:r>
-      <w:r>
-        <w:t xml:space="preserve">- t2’ breaks off at 30 degrees from t2, goes with Cone B (dark sector)</w:t>
+        <w:t xml:space="preserve">At contact, fragmentation begins. The energy of the fragmentation</w:t>
+      </w:r>
+      <w:r>
+        <w:t xml:space="preserve"> </w:t>
+      </w:r>
+      <w:r>
+        <w:t xml:space="preserve">asymmetry tilts the cones to 30 degrees. At this angle, the photon</w:t>
+      </w:r>
+      <w:r>
+        <w:t xml:space="preserve"> </w:t>
+      </w:r>
+      <w:r>
+        <w:t xml:space="preserve">mode becomes available (n = N, full precessional sweep on the φ-circle).</w:t>
       </w:r>
     </w:p>
     <w:p>
@@ -633,19 +603,39 @@
         <w:pStyle w:val="BodyText"/>
       </w:pPr>
       <w:r>
+        <w:t xml:space="preserve">At 30 degrees, Pin_{+,-,-} activates. The t2 vector splits:</w:t>
+      </w:r>
+      <w:r>
+        <w:t xml:space="preserve"> </w:t>
+      </w:r>
+      <w:r>
+        <w:t xml:space="preserve">- t2 stays with Cone A (visible sector), defining the φ-circle</w:t>
+      </w:r>
+      <w:r>
+        <w:t xml:space="preserve"> </w:t>
+      </w:r>
+      <w:r>
+        <w:t xml:space="preserve">- t2’ = t2 sin(30°) = t2/2 departs at 30° with Cone B (dark sector),</w:t>
+      </w:r>
+      <w:r>
+        <w:t xml:space="preserve"> </w:t>
+      </w:r>
+      <w:r>
+        <w:t xml:space="preserve">defining the φ’-circle</w:t>
+      </w:r>
+    </w:p>
+    <w:p>
+      <w:pPr>
+        <w:pStyle w:val="BodyText"/>
+      </w:pPr>
+      <w:r>
         <w:t xml:space="preserve">30 degrees is forced: sin(30) = 1/2 (the only non-trivial exact rational</w:t>
       </w:r>
       <w:r>
         <w:t xml:space="preserve"> </w:t>
       </w:r>
       <w:r>
-        <w:t xml:space="preserve">sine), equilateral cross-section (maximum rigidity). The cone cannot</w:t>
-      </w:r>
-      <w:r>
-        <w:t xml:space="preserve"> </w:t>
-      </w:r>
-      <w:r>
-        <w:t xml:space="preserve">compress further without breaking trilateral symmetry.</w:t>
+        <w:t xml:space="preserve">sine).</w:t>
       </w:r>
     </w:p>
     <w:bookmarkEnd w:id="16"/>
@@ -3221,13 +3211,677 @@
     </w:p>
     <w:bookmarkEnd w:id="27"/>
     <w:bookmarkEnd w:id="28"/>
-    <w:bookmarkStart w:id="29" w:name="problems-resolved-26"/>
+    <w:bookmarkStart w:id="29" w:name="dark-sector-cone-b"/>
     <w:p>
       <w:pPr>
         <w:pStyle w:val="Heading2"/>
       </w:pPr>
       <w:r>
-        <w:t xml:space="preserve">Problems Resolved (26)</w:t>
+        <w:t xml:space="preserve">Dark Sector (Cone B)</w:t>
+      </w:r>
+    </w:p>
+    <w:p>
+      <w:pPr>
+        <w:pStyle w:val="FirstParagraph"/>
+      </w:pPr>
+      <w:r>
+        <w:t xml:space="preserve">The second cone (Cone B) defines the dark sector. It shares the same</w:t>
+      </w:r>
+      <w:r>
+        <w:t xml:space="preserve"> </w:t>
+      </w:r>
+      <w:r>
+        <w:t xml:space="preserve">bare mass m0 = 246.22 GeV but operates on the φ’-circle with half</w:t>
+      </w:r>
+      <w:r>
+        <w:t xml:space="preserve"> </w:t>
+      </w:r>
+      <w:r>
+        <w:t xml:space="preserve">the radial time: σ’ = σ/2, giving N’ = N/2.</w:t>
+      </w:r>
+    </w:p>
+    <w:p>
+      <w:pPr>
+        <w:pStyle w:val="BodyText"/>
+      </w:pPr>
+      <w:r>
+        <w:rPr>
+          <w:b/>
+          <w:bCs/>
+        </w:rPr>
+        <w:t xml:space="preserve">Universal scaling law:</w:t>
+      </w:r>
+      <w:r>
+        <w:t xml:space="preserve"> </w:t>
+      </w:r>
+      <w:r>
+        <w:t xml:space="preserve">Every dark fermion mass is exactly √2 times</w:t>
+      </w:r>
+      <w:r>
+        <w:t xml:space="preserve"> </w:t>
+      </w:r>
+      <w:r>
+        <w:t xml:space="preserve">its visible counterpart. Origin: mass ~ 1/√σ, ratio = √(σ/σ’) = √2.</w:t>
+      </w:r>
+    </w:p>
+    <w:tbl>
+      <w:tblPr>
+        <w:tblStyle w:val="Table"/>
+        <w:tblW w:type="auto" w:w="0"/>
+        <w:tblLook w:firstRow="1" w:lastRow="0" w:firstColumn="0" w:lastColumn="0" w:noHBand="0" w:noVBand="0" w:val="0020"/>
+      </w:tblPr>
+      <w:tblGrid>
+        <w:gridCol w:w="1980"/>
+        <w:gridCol w:w="1980"/>
+        <w:gridCol w:w="1980"/>
+        <w:gridCol w:w="1980"/>
+      </w:tblGrid>
+      <w:tr>
+        <w:trPr>
+          <w:tblHeader w:val="on"/>
+        </w:trPr>
+        <w:tc>
+          <w:tcPr/>
+          <w:p>
+            <w:pPr>
+              <w:pStyle w:val="Compact"/>
+            </w:pPr>
+            <w:r>
+              <w:t xml:space="preserve">Dark particle</w:t>
+            </w:r>
+          </w:p>
+        </w:tc>
+        <w:tc>
+          <w:tcPr/>
+          <w:p>
+            <w:pPr>
+              <w:pStyle w:val="Compact"/>
+            </w:pPr>
+            <w:r>
+              <w:t xml:space="preserve">Dark mass</w:t>
+            </w:r>
+          </w:p>
+        </w:tc>
+        <w:tc>
+          <w:tcPr/>
+          <w:p>
+            <w:pPr>
+              <w:pStyle w:val="Compact"/>
+            </w:pPr>
+            <w:r>
+              <w:t xml:space="preserve">Visible mass</w:t>
+            </w:r>
+          </w:p>
+        </w:tc>
+        <w:tc>
+          <w:tcPr/>
+          <w:p>
+            <w:pPr>
+              <w:pStyle w:val="Compact"/>
+            </w:pPr>
+            <w:r>
+              <w:t xml:space="preserve">Ratio</w:t>
+            </w:r>
+          </w:p>
+        </w:tc>
+      </w:tr>
+      <w:tr>
+        <w:tc>
+          <w:tcPr/>
+          <w:p>
+            <w:pPr>
+              <w:pStyle w:val="Compact"/>
+            </w:pPr>
+            <w:r>
+              <w:t xml:space="preserve">Dark electron</w:t>
+            </w:r>
+          </w:p>
+        </w:tc>
+        <w:tc>
+          <w:tcPr/>
+          <w:p>
+            <w:pPr>
+              <w:pStyle w:val="Compact"/>
+            </w:pPr>
+            <w:r>
+              <w:t xml:space="preserve">0.727 MeV</w:t>
+            </w:r>
+          </w:p>
+        </w:tc>
+        <w:tc>
+          <w:tcPr/>
+          <w:p>
+            <w:pPr>
+              <w:pStyle w:val="Compact"/>
+            </w:pPr>
+            <w:r>
+              <w:t xml:space="preserve">0.514 MeV</w:t>
+            </w:r>
+          </w:p>
+        </w:tc>
+        <w:tc>
+          <w:tcPr/>
+          <w:p>
+            <w:pPr>
+              <w:pStyle w:val="Compact"/>
+            </w:pPr>
+            <w:r>
+              <w:t xml:space="preserve">√2</w:t>
+            </w:r>
+          </w:p>
+        </w:tc>
+      </w:tr>
+      <w:tr>
+        <w:tc>
+          <w:tcPr/>
+          <w:p>
+            <w:pPr>
+              <w:pStyle w:val="Compact"/>
+            </w:pPr>
+            <w:r>
+              <w:t xml:space="preserve">Dark muon</w:t>
+            </w:r>
+          </w:p>
+        </w:tc>
+        <w:tc>
+          <w:tcPr/>
+          <w:p>
+            <w:pPr>
+              <w:pStyle w:val="Compact"/>
+            </w:pPr>
+            <w:r>
+              <w:t xml:space="preserve">149.4 MeV</w:t>
+            </w:r>
+          </w:p>
+        </w:tc>
+        <w:tc>
+          <w:tcPr/>
+          <w:p>
+            <w:pPr>
+              <w:pStyle w:val="Compact"/>
+            </w:pPr>
+            <w:r>
+              <w:t xml:space="preserve">105.66 MeV</w:t>
+            </w:r>
+          </w:p>
+        </w:tc>
+        <w:tc>
+          <w:tcPr/>
+          <w:p>
+            <w:pPr>
+              <w:pStyle w:val="Compact"/>
+            </w:pPr>
+            <w:r>
+              <w:t xml:space="preserve">√2</w:t>
+            </w:r>
+          </w:p>
+        </w:tc>
+      </w:tr>
+      <w:tr>
+        <w:tc>
+          <w:tcPr/>
+          <w:p>
+            <w:pPr>
+              <w:pStyle w:val="Compact"/>
+            </w:pPr>
+            <w:r>
+              <w:t xml:space="preserve">Dark tau</w:t>
+            </w:r>
+          </w:p>
+        </w:tc>
+        <w:tc>
+          <w:tcPr/>
+          <w:p>
+            <w:pPr>
+              <w:pStyle w:val="Compact"/>
+            </w:pPr>
+            <w:r>
+              <w:t xml:space="preserve">2509 MeV</w:t>
+            </w:r>
+          </w:p>
+        </w:tc>
+        <w:tc>
+          <w:tcPr/>
+          <w:p>
+            <w:pPr>
+              <w:pStyle w:val="Compact"/>
+            </w:pPr>
+            <w:r>
+              <w:t xml:space="preserve">1774 MeV</w:t>
+            </w:r>
+          </w:p>
+        </w:tc>
+        <w:tc>
+          <w:tcPr/>
+          <w:p>
+            <w:pPr>
+              <w:pStyle w:val="Compact"/>
+            </w:pPr>
+            <w:r>
+              <w:t xml:space="preserve">√2</w:t>
+            </w:r>
+          </w:p>
+        </w:tc>
+      </w:tr>
+    </w:tbl>
+    <w:p>
+      <w:pPr>
+        <w:pStyle w:val="BodyText"/>
+      </w:pPr>
+      <w:r>
+        <w:rPr>
+          <w:b/>
+          <w:bCs/>
+        </w:rPr>
+        <w:t xml:space="preserve">Key result:</w:t>
+      </w:r>
+      <w:r>
+        <w:t xml:space="preserve"> </w:t>
+      </w:r>
+      <w:r>
+        <w:t xml:space="preserve">The dark electron mass = √(2m₀²/N) = 105.67 MeV = muon mass</w:t>
+      </w:r>
+      <w:r>
+        <w:t xml:space="preserve"> </w:t>
+      </w:r>
+      <w:r>
+        <w:t xml:space="preserve">(100.0% match). The muon IS the dark electron’s shadow in the visible sector.</w:t>
+      </w:r>
+    </w:p>
+    <w:p>
+      <w:pPr>
+        <w:pStyle w:val="BodyText"/>
+      </w:pPr>
+      <w:r>
+        <w:rPr>
+          <w:b/>
+          <w:bCs/>
+        </w:rPr>
+        <w:t xml:space="preserve">Three generations from two φ-circles:</w:t>
+      </w:r>
+      <w:r>
+        <w:t xml:space="preserve"> </w:t>
+      </w:r>
+      <w:r>
+        <w:t xml:space="preserve">- 1st generation: φ-circle eigenstates (e, u, d)</w:t>
+      </w:r>
+      <w:r>
+        <w:t xml:space="preserve"> </w:t>
+      </w:r>
+      <w:r>
+        <w:t xml:space="preserve">- 2nd generation: φ’-circle shadows (μ, c, s)</w:t>
+      </w:r>
+      <w:r>
+        <w:t xml:space="preserve"> </w:t>
+      </w:r>
+      <w:r>
+        <w:t xml:space="preserve">- 3rd generation: φ × φ’ interference (τ, t, b)</w:t>
+      </w:r>
+    </w:p>
+    <w:p>
+      <w:pPr>
+        <w:pStyle w:val="BodyText"/>
+      </w:pPr>
+      <w:r>
+        <w:rPr>
+          <w:b/>
+          <w:bCs/>
+        </w:rPr>
+        <w:t xml:space="preserve">Bottom quark:</w:t>
+      </w:r>
+      <w:r>
+        <w:t xml:space="preserve"> </w:t>
+      </w:r>
+      <w:r>
+        <w:t xml:space="preserve">m_b = (7/3) × m_tau. The 7 comes from Fano plane points,</w:t>
+      </w:r>
+      <w:r>
+        <w:t xml:space="preserve"> </w:t>
+      </w:r>
+      <w:r>
+        <w:t xml:space="preserve">the 3 from points per line = quark colors. Computed: 4148 MeV, observed:</w:t>
+      </w:r>
+      <w:r>
+        <w:t xml:space="preserve"> </w:t>
+      </w:r>
+      <w:r>
+        <w:t xml:space="preserve">4180 MeV (99.2% match).</w:t>
+      </w:r>
+    </w:p>
+    <w:p>
+      <w:pPr>
+        <w:pStyle w:val="BodyText"/>
+      </w:pPr>
+      <w:r>
+        <w:rPr>
+          <w:b/>
+          <w:bCs/>
+        </w:rPr>
+        <w:t xml:space="preserve">Graviton wall:</w:t>
+      </w:r>
+      <w:r>
+        <w:t xml:space="preserve"> </w:t>
+      </w:r>
+      <w:r>
+        <w:t xml:space="preserve">8 gravitons at ~1 GeV each sit at the boundary σ = Δ</w:t>
+      </w:r>
+      <w:r>
+        <w:t xml:space="preserve"> </w:t>
+      </w:r>
+      <w:r>
+        <w:t xml:space="preserve">between visible and dark sectors. Dark matter pressure = sin²(30°) = 1/4.</w:t>
+      </w:r>
+      <w:r>
+        <w:t xml:space="preserve"> </w:t>
+      </w:r>
+      <w:r>
+        <w:t xml:space="preserve">Visible matter pressure = cos²(30°) = 3/4. One wall, one gravity.</w:t>
+      </w:r>
+    </w:p>
+    <w:p>
+      <w:pPr>
+        <w:pStyle w:val="BodyText"/>
+      </w:pPr>
+      <w:r>
+        <w:rPr>
+          <w:b/>
+          <w:bCs/>
+        </w:rPr>
+        <w:t xml:space="preserve">Bullet Cluster consistency:</w:t>
+      </w:r>
+      <w:r>
+        <w:t xml:space="preserve"> </w:t>
+      </w:r>
+      <w:r>
+        <w:t xml:space="preserve">Dark-visible cross section suppressed by</w:t>
+      </w:r>
+      <w:r>
+        <w:t xml:space="preserve"> </w:t>
+      </w:r>
+      <w:r>
+        <w:t xml:space="preserve">ε² ~ 5.6 × 10⁻¹⁰ (two α-vertices across the graviton wall). Dark matter</w:t>
+      </w:r>
+      <w:r>
+        <w:t xml:space="preserve"> </w:t>
+      </w:r>
+      <w:r>
+        <w:t xml:space="preserve">passes through visible matter 1.8 billion times more weakly.</w:t>
+      </w:r>
+    </w:p>
+    <w:p>
+      <w:r>
+        <w:pict>
+          <v:rect style="width:0;height:1.5pt" o:hralign="center" o:hrstd="t" o:hr="t"/>
+        </w:pict>
+      </w:r>
+    </w:p>
+    <w:bookmarkEnd w:id="29"/>
+    <w:bookmarkStart w:id="33" w:name="derived-equations"/>
+    <w:p>
+      <w:pPr>
+        <w:pStyle w:val="Heading2"/>
+      </w:pPr>
+      <w:r>
+        <w:t xml:space="preserve">Derived Equations</w:t>
+      </w:r>
+    </w:p>
+    <w:bookmarkStart w:id="30" w:name="maxwell-from-torsion"/>
+    <w:p>
+      <w:pPr>
+        <w:pStyle w:val="Heading3"/>
+      </w:pPr>
+      <w:r>
+        <w:t xml:space="preserve">Maxwell from Torsion</w:t>
+      </w:r>
+    </w:p>
+    <w:p>
+      <w:pPr>
+        <w:pStyle w:val="FirstParagraph"/>
+      </w:pPr>
+      <w:r>
+        <w:t xml:space="preserve">All four Maxwell equations emerge from the torsion structure:</w:t>
+      </w:r>
+    </w:p>
+    <w:tbl>
+      <w:tblPr>
+        <w:tblStyle w:val="Table"/>
+        <w:tblW w:type="auto" w:w="0"/>
+        <w:tblLook w:firstRow="1" w:lastRow="0" w:firstColumn="0" w:lastColumn="0" w:noHBand="0" w:noVBand="0" w:val="0020"/>
+      </w:tblPr>
+      <w:tblGrid>
+        <w:gridCol w:w="3960"/>
+        <w:gridCol w:w="3960"/>
+      </w:tblGrid>
+      <w:tr>
+        <w:trPr>
+          <w:tblHeader w:val="on"/>
+        </w:trPr>
+        <w:tc>
+          <w:tcPr/>
+          <w:p>
+            <w:pPr>
+              <w:pStyle w:val="Compact"/>
+            </w:pPr>
+            <w:r>
+              <w:t xml:space="preserve">Maxwell equation</w:t>
+            </w:r>
+          </w:p>
+        </w:tc>
+        <w:tc>
+          <w:tcPr/>
+          <w:p>
+            <w:pPr>
+              <w:pStyle w:val="Compact"/>
+            </w:pPr>
+            <w:r>
+              <w:t xml:space="preserve">Torsion origin</w:t>
+            </w:r>
+          </w:p>
+        </w:tc>
+      </w:tr>
+      <w:tr>
+        <w:tc>
+          <w:tcPr/>
+          <w:p>
+            <w:pPr>
+              <w:pStyle w:val="Compact"/>
+            </w:pPr>
+            <w:r>
+              <w:t xml:space="preserve">∇·B = 0</w:t>
+            </w:r>
+          </w:p>
+        </w:tc>
+        <w:tc>
+          <w:tcPr/>
+          <w:p>
+            <w:pPr>
+              <w:pStyle w:val="Compact"/>
+            </w:pPr>
+            <w:r>
+              <w:t xml:space="preserve">φ is S¹ (circle has no boundary)</w:t>
+            </w:r>
+          </w:p>
+        </w:tc>
+      </w:tr>
+      <w:tr>
+        <w:tc>
+          <w:tcPr/>
+          <w:p>
+            <w:pPr>
+              <w:pStyle w:val="Compact"/>
+            </w:pPr>
+            <w:r>
+              <w:t xml:space="preserve">∇×E = −∂B/∂t</w:t>
+            </w:r>
+          </w:p>
+        </w:tc>
+        <w:tc>
+          <w:tcPr/>
+          <w:p>
+            <w:pPr>
+              <w:pStyle w:val="Compact"/>
+            </w:pPr>
+            <w:r>
+              <w:t xml:space="preserve">Bianchi identity: dF = 0</w:t>
+            </w:r>
+          </w:p>
+        </w:tc>
+      </w:tr>
+      <w:tr>
+        <w:tc>
+          <w:tcPr/>
+          <w:p>
+            <w:pPr>
+              <w:pStyle w:val="Compact"/>
+            </w:pPr>
+            <w:r>
+              <w:t xml:space="preserve">∇·E = ρ/ε₀</w:t>
+            </w:r>
+          </w:p>
+        </w:tc>
+        <w:tc>
+          <w:tcPr/>
+          <w:p>
+            <w:pPr>
+              <w:pStyle w:val="Compact"/>
+            </w:pPr>
+            <w:r>
+              <w:t xml:space="preserve">TEGR field equation (torsion source)</w:t>
+            </w:r>
+          </w:p>
+        </w:tc>
+      </w:tr>
+      <w:tr>
+        <w:tc>
+          <w:tcPr/>
+          <w:p>
+            <w:pPr>
+              <w:pStyle w:val="Compact"/>
+            </w:pPr>
+            <w:r>
+              <w:t xml:space="preserve">∇×B = μ₀J + ∂E/∂t/c²</w:t>
+            </w:r>
+          </w:p>
+        </w:tc>
+        <w:tc>
+          <w:tcPr/>
+          <w:p>
+            <w:pPr>
+              <w:pStyle w:val="Compact"/>
+            </w:pPr>
+            <w:r>
+              <w:t xml:space="preserve">TEGR field equation (spatial part)</w:t>
+            </w:r>
+          </w:p>
+        </w:tc>
+      </w:tr>
+    </w:tbl>
+    <w:p>
+      <w:pPr>
+        <w:pStyle w:val="BodyText"/>
+      </w:pPr>
+      <w:r>
+        <w:t xml:space="preserve">Constants ε₀, μ₀ from α = 1/137. Zero free constants in EM.</w:t>
+      </w:r>
+    </w:p>
+    <w:bookmarkEnd w:id="30"/>
+    <w:bookmarkStart w:id="31" w:name="schrödinger-from-5d"/>
+    <w:p>
+      <w:pPr>
+        <w:pStyle w:val="Heading3"/>
+      </w:pPr>
+      <w:r>
+        <w:t xml:space="preserve">Schrödinger from 5D</w:t>
+      </w:r>
+    </w:p>
+    <w:p>
+      <w:pPr>
+        <w:pStyle w:val="FirstParagraph"/>
+      </w:pPr>
+      <w:r>
+        <w:t xml:space="preserve">The Schrödinger equation is the non-relativistic limit of the 5D wave</w:t>
+      </w:r>
+      <w:r>
+        <w:t xml:space="preserve"> </w:t>
+      </w:r>
+      <w:r>
+        <w:t xml:space="preserve">equation:</w:t>
+      </w:r>
+    </w:p>
+    <w:p>
+      <w:pPr>
+        <w:pStyle w:val="BodyText"/>
+      </w:pPr>
+      <w:r>
+        <w:t xml:space="preserve">□₅Ψ = 0 → separate on φ-circle → (□₄ + m_n²)ψ_n = 0 → Bessel equation</w:t>
+      </w:r>
+      <w:r>
+        <w:t xml:space="preserve"> </w:t>
+      </w:r>
+      <w:r>
+        <w:t xml:space="preserve">→ non-rel limit: iℏ ∂ψ/∂t = −ℏ²/(2m) ∇²ψ</w:t>
+      </w:r>
+    </w:p>
+    <w:p>
+      <w:pPr>
+        <w:pStyle w:val="BodyText"/>
+      </w:pPr>
+      <w:r>
+        <w:t xml:space="preserve">Potentials from contorsion: V_grav from K₀₁, V_EM from K₀ᵢ.</w:t>
+      </w:r>
+    </w:p>
+    <w:bookmarkEnd w:id="31"/>
+    <w:bookmarkStart w:id="32" w:name="general-relativity-as-late-time-limit"/>
+    <w:p>
+      <w:pPr>
+        <w:pStyle w:val="Heading3"/>
+      </w:pPr>
+      <w:r>
+        <w:t xml:space="preserve">General Relativity as Late-Time Limit</w:t>
+      </w:r>
+    </w:p>
+    <w:p>
+      <w:pPr>
+        <w:pStyle w:val="FirstParagraph"/>
+      </w:pPr>
+      <w:r>
+        <w:t xml:space="preserve">The identity R(ω) = −D(K) − K∧K shows that GR curvature equals torsion</w:t>
+      </w:r>
+      <w:r>
+        <w:t xml:space="preserve"> </w:t>
+      </w:r>
+      <w:r>
+        <w:t xml:space="preserve">squared. The Einstein equation is a rewriting of the TEGR torsion field</w:t>
+      </w:r>
+      <w:r>
+        <w:t xml:space="preserve"> </w:t>
+      </w:r>
+      <w:r>
+        <w:t xml:space="preserve">equation, not an independent law. GR is the late-time macroscopic limit</w:t>
+      </w:r>
+      <w:r>
+        <w:t xml:space="preserve"> </w:t>
+      </w:r>
+      <w:r>
+        <w:t xml:space="preserve">of the two-twistor framework.</w:t>
+      </w:r>
+    </w:p>
+    <w:p>
+      <w:r>
+        <w:pict>
+          <v:rect style="width:0;height:1.5pt" o:hralign="center" o:hrstd="t" o:hr="t"/>
+        </w:pict>
+      </w:r>
+    </w:p>
+    <w:bookmarkEnd w:id="32"/>
+    <w:bookmarkEnd w:id="33"/>
+    <w:bookmarkStart w:id="34" w:name="problems-resolved-33"/>
+    <w:p>
+      <w:pPr>
+        <w:pStyle w:val="Heading2"/>
+      </w:pPr>
+      <w:r>
+        <w:t xml:space="preserve">Problems Resolved (33+)</w:t>
       </w:r>
     </w:p>
     <w:p>
@@ -3567,14 +4221,108 @@
       </w:r>
     </w:p>
     <w:p>
+      <w:pPr>
+        <w:pStyle w:val="Compact"/>
+        <w:numPr>
+          <w:ilvl w:val="0"/>
+          <w:numId w:val="1004"/>
+        </w:numPr>
+      </w:pPr>
+      <w:r>
+        <w:t xml:space="preserve">Three generations origin — two phi-circles (phi, phi’), three generation types</w:t>
+      </w:r>
+    </w:p>
+    <w:p>
+      <w:pPr>
+        <w:pStyle w:val="Compact"/>
+        <w:numPr>
+          <w:ilvl w:val="0"/>
+          <w:numId w:val="1004"/>
+        </w:numPr>
+      </w:pPr>
+      <w:r>
+        <w:t xml:space="preserve">Muon identity — dark electron shadow in visible sector (105.67 MeV exact)</w:t>
+      </w:r>
+    </w:p>
+    <w:p>
+      <w:pPr>
+        <w:pStyle w:val="Compact"/>
+        <w:numPr>
+          <w:ilvl w:val="0"/>
+          <w:numId w:val="1004"/>
+        </w:numPr>
+      </w:pPr>
+      <w:r>
+        <w:t xml:space="preserve">Bottom quark mass — m_b = (7/3)*m_tau from Fano geometry (99.2%)</w:t>
+      </w:r>
+    </w:p>
+    <w:p>
+      <w:pPr>
+        <w:pStyle w:val="Compact"/>
+        <w:numPr>
+          <w:ilvl w:val="0"/>
+          <w:numId w:val="1004"/>
+        </w:numPr>
+      </w:pPr>
+      <w:r>
+        <w:t xml:space="preserve">Maxwell equations — all four derived from torsion (dF=0 Bianchi, d</w:t>
+      </w:r>
+      <w:r>
+        <w:rPr>
+          <w:i/>
+          <w:iCs/>
+        </w:rPr>
+        <w:t xml:space="preserve">F=</w:t>
+      </w:r>
+      <w:r>
+        <w:t xml:space="preserve">J TEGR)</w:t>
+      </w:r>
+    </w:p>
+    <w:p>
+      <w:pPr>
+        <w:pStyle w:val="Compact"/>
+        <w:numPr>
+          <w:ilvl w:val="0"/>
+          <w:numId w:val="1004"/>
+        </w:numPr>
+      </w:pPr>
+      <w:r>
+        <w:t xml:space="preserve">Schrodinger equation — non-relativistic limit of 5D wave equation on phi-circle</w:t>
+      </w:r>
+    </w:p>
+    <w:p>
+      <w:pPr>
+        <w:pStyle w:val="Compact"/>
+        <w:numPr>
+          <w:ilvl w:val="0"/>
+          <w:numId w:val="1004"/>
+        </w:numPr>
+      </w:pPr>
+      <w:r>
+        <w:t xml:space="preserve">GR as late-time limit — Einstein equation = rewritten TEGR torsion equation</w:t>
+      </w:r>
+    </w:p>
+    <w:p>
+      <w:pPr>
+        <w:pStyle w:val="Compact"/>
+        <w:numPr>
+          <w:ilvl w:val="0"/>
+          <w:numId w:val="1004"/>
+        </w:numPr>
+      </w:pPr>
+      <w:r>
+        <w:t xml:space="preserve">Bullet Cluster — dark-visible cross section suppressed by eps^2 ~ 5.6e-10</w:t>
+      </w:r>
+    </w:p>
+    <w:p>
       <w:r>
         <w:pict>
           <v:rect style="width:0;height:1.5pt" o:hralign="center" o:hrstd="t" o:hr="t"/>
         </w:pict>
       </w:r>
     </w:p>
-    <w:bookmarkEnd w:id="29"/>
-    <w:bookmarkStart w:id="30" w:name="energy-budget"/>
+    <w:bookmarkEnd w:id="34"/>
+    <w:bookmarkStart w:id="35" w:name="energy-budget"/>
     <w:p>
       <w:pPr>
         <w:pStyle w:val="Heading2"/>
@@ -3656,8 +4404,8 @@
         </w:pict>
       </w:r>
     </w:p>
-    <w:bookmarkEnd w:id="30"/>
-    <w:bookmarkStart w:id="31" w:name="the-dispersion-relation"/>
+    <w:bookmarkEnd w:id="35"/>
+    <w:bookmarkStart w:id="36" w:name="the-dispersion-relation"/>
     <w:p>
       <w:pPr>
         <w:pStyle w:val="Heading2"/>
@@ -3803,8 +4551,8 @@
         </w:pict>
       </w:r>
     </w:p>
-    <w:bookmarkEnd w:id="31"/>
-    <w:bookmarkStart w:id="32" w:name="entanglement"/>
+    <w:bookmarkEnd w:id="36"/>
+    <w:bookmarkStart w:id="37" w:name="entanglement"/>
     <w:p>
       <w:pPr>
         <w:pStyle w:val="Heading2"/>
@@ -3888,8 +4636,8 @@
         </w:pict>
       </w:r>
     </w:p>
-    <w:bookmarkEnd w:id="32"/>
-    <w:bookmarkStart w:id="33" w:name="zero-energy-balance"/>
+    <w:bookmarkEnd w:id="37"/>
+    <w:bookmarkStart w:id="38" w:name="zero-energy-balance"/>
     <w:p>
       <w:pPr>
         <w:pStyle w:val="Heading2"/>
@@ -4038,8 +4786,8 @@
         <w:t xml:space="preserve">alpha^2/9), not from measured masses. Zero external inputs.</w:t>
       </w:r>
     </w:p>
-    <w:bookmarkEnd w:id="33"/>
-    <w:bookmarkStart w:id="34" w:name="testable-predictions"/>
+    <w:bookmarkEnd w:id="38"/>
+    <w:bookmarkStart w:id="39" w:name="testable-predictions"/>
     <w:p>
       <w:pPr>
         <w:pStyle w:val="Heading2"/>
@@ -4132,8 +4880,44 @@
         <w:t xml:space="preserve">Permanent entanglement via (t2, t2’) eigenstate at 30-degree spin angle</w:t>
       </w:r>
     </w:p>
-    <w:bookmarkEnd w:id="34"/>
-    <w:bookmarkStart w:id="35" w:name="intellectual-foundations"/>
+    <w:p>
+      <w:pPr>
+        <w:pStyle w:val="Compact"/>
+        <w:numPr>
+          <w:ilvl w:val="0"/>
+          <w:numId w:val="1007"/>
+        </w:numPr>
+      </w:pPr>
+      <w:r>
+        <w:t xml:space="preserve">Universal sqrt(2) dark/visible mass ratio for all fermions</w:t>
+      </w:r>
+    </w:p>
+    <w:p>
+      <w:pPr>
+        <w:pStyle w:val="Compact"/>
+        <w:numPr>
+          <w:ilvl w:val="0"/>
+          <w:numId w:val="1007"/>
+        </w:numPr>
+      </w:pPr>
+      <w:r>
+        <w:t xml:space="preserve">Dark photon kinetic mixing eps = 4*alpha^2/9 = 2.37e-5</w:t>
+      </w:r>
+    </w:p>
+    <w:p>
+      <w:pPr>
+        <w:pStyle w:val="Compact"/>
+        <w:numPr>
+          <w:ilvl w:val="0"/>
+          <w:numId w:val="1007"/>
+        </w:numPr>
+      </w:pPr>
+      <w:r>
+        <w:t xml:space="preserve">Dark Chandrasekhar limit at 0.7 M_sun (half of visible)</w:t>
+      </w:r>
+    </w:p>
+    <w:bookmarkEnd w:id="39"/>
+    <w:bookmarkStart w:id="40" w:name="intellectual-foundations"/>
     <w:p>
       <w:pPr>
         <w:pStyle w:val="Heading2"/>
@@ -4237,8 +5021,8 @@
         </w:pict>
       </w:r>
     </w:p>
-    <w:bookmarkEnd w:id="35"/>
-    <w:bookmarkStart w:id="36" w:name="repository-structure"/>
+    <w:bookmarkEnd w:id="40"/>
+    <w:bookmarkStart w:id="41" w:name="repository-structure"/>
     <w:p>
       <w:pPr>
         <w:pStyle w:val="Heading2"/>
@@ -4255,7 +5039,16 @@
         <w:rPr>
           <w:rStyle w:val="VerbatimChar"/>
         </w:rPr>
-        <w:t xml:space="preserve">paper/          - The main paper (forthcoming)</w:t>
+        <w:t xml:space="preserve">DOCUMENTATION_INDEX.md  - Complete intellectual lineage and 23 original innovations</w:t>
+      </w:r>
+      <w:r>
+        <w:br/>
+      </w:r>
+      <w:r>
+        <w:rPr>
+          <w:rStyle w:val="VerbatimChar"/>
+        </w:rPr>
+        <w:t xml:space="preserve">paper/          - Papers (PAPER.md/docx/pdf, PAPER_II.md/docx/pdf)</w:t>
       </w:r>
       <w:r>
         <w:br/>
@@ -4300,7 +5093,7 @@
         <w:rPr>
           <w:rStyle w:val="VerbatimChar"/>
         </w:rPr>
-        <w:t xml:space="preserve">codes/          - Computational codes (forthcoming)</w:t>
+        <w:t xml:space="preserve">codes/          - Computational codes (Python + JavaScript)</w:t>
       </w:r>
       <w:r>
         <w:br/>
@@ -4309,7 +5102,70 @@
         <w:rPr>
           <w:rStyle w:val="VerbatimChar"/>
         </w:rPr>
-        <w:t xml:space="preserve">data/           - Numerical results and tables (forthcoming)</w:t>
+        <w:t xml:space="preserve">                  01-06_*.py (original computations)</w:t>
+      </w:r>
+      <w:r>
+        <w:br/>
+      </w:r>
+      <w:r>
+        <w:rPr>
+          <w:rStyle w:val="VerbatimChar"/>
+        </w:rPr>
+        <w:t xml:space="preserve">                  compute_*.js (dark sector, Maxwell, Schrodinger, etc.)</w:t>
+      </w:r>
+      <w:r>
+        <w:br/>
+      </w:r>
+      <w:r>
+        <w:rPr>
+          <w:rStyle w:val="VerbatimChar"/>
+        </w:rPr>
+        <w:t xml:space="preserve">data/           - Numerical results (complete_results.md/docx/pdf,</w:t>
+      </w:r>
+      <w:r>
+        <w:br/>
+      </w:r>
+      <w:r>
+        <w:rPr>
+          <w:rStyle w:val="VerbatimChar"/>
+        </w:rPr>
+        <w:t xml:space="preserve">                  Unified_Mass_Table.xlsx)</w:t>
+      </w:r>
+      <w:r>
+        <w:br/>
+      </w:r>
+      <w:r>
+        <w:rPr>
+          <w:rStyle w:val="VerbatimChar"/>
+        </w:rPr>
+        <w:t xml:space="preserve">visuals/        - Interactive visualizations (10 files)</w:t>
+      </w:r>
+      <w:r>
+        <w:br/>
+      </w:r>
+      <w:r>
+        <w:rPr>
+          <w:rStyle w:val="VerbatimChar"/>
+        </w:rPr>
+        <w:t xml:space="preserve">                  HTML: equation poster, results charts, graph hierarchy,</w:t>
+      </w:r>
+      <w:r>
+        <w:br/>
+      </w:r>
+      <w:r>
+        <w:rPr>
+          <w:rStyle w:val="VerbatimChar"/>
+        </w:rPr>
+        <w:t xml:space="preserve">                  spacetime, four cones, step-out angle diagram</w:t>
+      </w:r>
+      <w:r>
+        <w:br/>
+      </w:r>
+      <w:r>
+        <w:rPr>
+          <w:rStyle w:val="VerbatimChar"/>
+        </w:rPr>
+        <w:t xml:space="preserve">                  JSX: cone rotation, precession lab, precession hierarchy</w:t>
       </w:r>
     </w:p>
     <w:p>
@@ -4319,8 +5175,8 @@
         </w:pict>
       </w:r>
     </w:p>
-    <w:bookmarkEnd w:id="36"/>
-    <w:bookmarkStart w:id="37" w:name="on-the-nature-of-the-predictions"/>
+    <w:bookmarkEnd w:id="41"/>
+    <w:bookmarkStart w:id="42" w:name="on-the-nature-of-the-predictions"/>
     <w:p>
       <w:pPr>
         <w:pStyle w:val="Heading2"/>
@@ -4434,8 +5290,8 @@
         </w:pict>
       </w:r>
     </w:p>
-    <w:bookmarkEnd w:id="37"/>
-    <w:bookmarkStart w:id="38" w:name="license"/>
+    <w:bookmarkEnd w:id="42"/>
+    <w:bookmarkStart w:id="43" w:name="license"/>
     <w:p>
       <w:pPr>
         <w:pStyle w:val="Heading2"/>
@@ -4460,8 +5316,8 @@
         <w:t xml:space="preserve">Prior art established by this repository’s git commit timestamps.</w:t>
       </w:r>
     </w:p>
-    <w:bookmarkEnd w:id="38"/>
-    <w:bookmarkEnd w:id="39"/>
+    <w:bookmarkEnd w:id="43"/>
+    <w:bookmarkEnd w:id="44"/>
     <w:sectPr>
       <w:footnotePr>
         <w:numRestart w:val="eachSect"/>

</xml_diff>